<commit_message>
making mongo db server
</commit_message>
<xml_diff>
--- a/docker.docx
+++ b/docker.docx
@@ -1340,44 +1340,23 @@
           <w:rFonts w:eastAsia="Times New Roman" w:cstheme="minorHAnsi"/>
           <w:lang w:eastAsia="en-IN"/>
         </w:rPr>
-        <w:t xml:space="preserve">For </w:t>
-      </w:r>
-      <w:r>
-        <w:rPr>
-          <w:rFonts w:eastAsia="Times New Roman" w:cstheme="minorHAnsi"/>
-          <w:lang w:eastAsia="en-IN"/>
-        </w:rPr>
-        <w:t>check</w:t>
-      </w:r>
-      <w:r>
-        <w:rPr>
-          <w:rFonts w:eastAsia="Times New Roman" w:cstheme="minorHAnsi"/>
-          <w:lang w:eastAsia="en-IN"/>
-        </w:rPr>
-        <w:t xml:space="preserve"> network</w:t>
-      </w:r>
-      <w:r>
-        <w:rPr>
-          <w:rFonts w:eastAsia="Times New Roman" w:cstheme="minorHAnsi"/>
-          <w:lang w:eastAsia="en-IN"/>
-        </w:rPr>
-        <w:t xml:space="preserve"> list</w:t>
-      </w:r>
-      <w:bookmarkStart w:id="0" w:name="_GoBack"/>
-      <w:bookmarkEnd w:id="0"/>
-      <w:r>
-        <w:rPr>
-          <w:rFonts w:eastAsia="Times New Roman" w:cstheme="minorHAnsi"/>
-          <w:lang w:eastAsia="en-IN"/>
-        </w:rPr>
-        <w:t>-&gt;</w:t>
-      </w:r>
-      <w:r>
-        <w:rPr>
-          <w:rFonts w:eastAsia="Times New Roman" w:cstheme="minorHAnsi"/>
-          <w:lang w:eastAsia="en-IN"/>
-        </w:rPr>
-        <w:t xml:space="preserve">docker network </w:t>
+        <w:t>For check network list-&gt;</w:t>
+      </w:r>
+      <w:proofErr w:type="spellStart"/>
+      <w:r>
+        <w:rPr>
+          <w:rFonts w:eastAsia="Times New Roman" w:cstheme="minorHAnsi"/>
+          <w:lang w:eastAsia="en-IN"/>
+        </w:rPr>
+        <w:t>docker</w:t>
+      </w:r>
+      <w:proofErr w:type="spellEnd"/>
+      <w:r>
+        <w:rPr>
+          <w:rFonts w:eastAsia="Times New Roman" w:cstheme="minorHAnsi"/>
+          <w:lang w:eastAsia="en-IN"/>
+        </w:rPr>
+        <w:t xml:space="preserve"> network </w:t>
       </w:r>
       <w:proofErr w:type="spellStart"/>
       <w:r>
@@ -1812,8 +1791,116 @@
           <w:sz w:val="22"/>
           <w:szCs w:val="22"/>
         </w:rPr>
-        <w:t xml:space="preserve"> -u root -p</w:t>
-      </w:r>
+        <w:t xml:space="preserve"> -u root </w:t>
+      </w:r>
+      <w:r>
+        <w:rPr>
+          <w:rFonts w:asciiTheme="minorHAnsi" w:hAnsiTheme="minorHAnsi" w:cstheme="minorHAnsi"/>
+          <w:sz w:val="22"/>
+          <w:szCs w:val="22"/>
+        </w:rPr>
+        <w:t>–</w:t>
+      </w:r>
+      <w:r>
+        <w:rPr>
+          <w:rFonts w:asciiTheme="minorHAnsi" w:hAnsiTheme="minorHAnsi" w:cstheme="minorHAnsi"/>
+          <w:sz w:val="22"/>
+          <w:szCs w:val="22"/>
+        </w:rPr>
+        <w:t>p</w:t>
+      </w:r>
+    </w:p>
+    <w:p>
+      <w:pPr>
+        <w:pStyle w:val="NormalWeb"/>
+        <w:rPr>
+          <w:rFonts w:asciiTheme="minorHAnsi" w:hAnsiTheme="minorHAnsi" w:cstheme="minorHAnsi"/>
+          <w:sz w:val="22"/>
+          <w:szCs w:val="22"/>
+        </w:rPr>
+      </w:pPr>
+      <w:r>
+        <w:rPr>
+          <w:rFonts w:asciiTheme="minorHAnsi" w:hAnsiTheme="minorHAnsi" w:cstheme="minorHAnsi"/>
+          <w:sz w:val="22"/>
+          <w:szCs w:val="22"/>
+        </w:rPr>
+        <w:t xml:space="preserve">To </w:t>
+      </w:r>
+      <w:proofErr w:type="spellStart"/>
+      <w:r>
+        <w:rPr>
+          <w:rFonts w:asciiTheme="minorHAnsi" w:hAnsiTheme="minorHAnsi" w:cstheme="minorHAnsi"/>
+          <w:sz w:val="22"/>
+          <w:szCs w:val="22"/>
+        </w:rPr>
+        <w:t>oprn</w:t>
+      </w:r>
+      <w:proofErr w:type="spellEnd"/>
+      <w:r>
+        <w:rPr>
+          <w:rFonts w:asciiTheme="minorHAnsi" w:hAnsiTheme="minorHAnsi" w:cstheme="minorHAnsi"/>
+          <w:sz w:val="22"/>
+          <w:szCs w:val="22"/>
+        </w:rPr>
+        <w:t xml:space="preserve"> mongo </w:t>
+      </w:r>
+      <w:proofErr w:type="spellStart"/>
+      <w:r>
+        <w:rPr>
+          <w:rFonts w:asciiTheme="minorHAnsi" w:hAnsiTheme="minorHAnsi" w:cstheme="minorHAnsi"/>
+          <w:sz w:val="22"/>
+          <w:szCs w:val="22"/>
+        </w:rPr>
+        <w:t>db</w:t>
+      </w:r>
+      <w:proofErr w:type="spellEnd"/>
+      <w:r>
+        <w:rPr>
+          <w:rFonts w:asciiTheme="minorHAnsi" w:hAnsiTheme="minorHAnsi" w:cstheme="minorHAnsi"/>
+          <w:sz w:val="22"/>
+          <w:szCs w:val="22"/>
+        </w:rPr>
+        <w:t>-&gt;</w:t>
+      </w:r>
+      <w:proofErr w:type="spellStart"/>
+      <w:r>
+        <w:rPr>
+          <w:rFonts w:asciiTheme="minorHAnsi" w:hAnsiTheme="minorHAnsi" w:cstheme="minorHAnsi"/>
+          <w:sz w:val="22"/>
+          <w:szCs w:val="22"/>
+        </w:rPr>
+        <w:t>mongosh</w:t>
+      </w:r>
+      <w:proofErr w:type="spellEnd"/>
+      <w:r>
+        <w:rPr>
+          <w:rFonts w:asciiTheme="minorHAnsi" w:hAnsiTheme="minorHAnsi" w:cstheme="minorHAnsi"/>
+          <w:sz w:val="22"/>
+          <w:szCs w:val="22"/>
+        </w:rPr>
+        <w:t xml:space="preserve"> -u root -p 12345 --</w:t>
+      </w:r>
+      <w:proofErr w:type="spellStart"/>
+      <w:r>
+        <w:rPr>
+          <w:rFonts w:asciiTheme="minorHAnsi" w:hAnsiTheme="minorHAnsi" w:cstheme="minorHAnsi"/>
+          <w:sz w:val="22"/>
+          <w:szCs w:val="22"/>
+        </w:rPr>
+        <w:t>authenticationDatabase</w:t>
+      </w:r>
+      <w:proofErr w:type="spellEnd"/>
+      <w:r>
+        <w:rPr>
+          <w:rFonts w:asciiTheme="minorHAnsi" w:hAnsiTheme="minorHAnsi" w:cstheme="minorHAnsi"/>
+          <w:sz w:val="22"/>
+          <w:szCs w:val="22"/>
+        </w:rPr>
+        <w:t xml:space="preserve"> admin</w:t>
+      </w:r>
+      <w:bookmarkStart w:id="0" w:name="_GoBack"/>
+      <w:bookmarkEnd w:id="0"/>
     </w:p>
     <w:p/>
     <w:sectPr>

</xml_diff>